<commit_message>
Make report intermediate, plan modules 3-5 and explain saved request history
</commit_message>
<xml_diff>
--- a/docs/Encore_Report.docx
+++ b/docs/Encore_Report.docx
@@ -135,41 +135,24 @@
           <w:color w:val="000000"/>
           <w:sz w:val="28"/>
         </w:rPr>
-        <w:t>6 ПРОВЕРКА РАБОТОСПОСОБНОСТИ</w:t>
-      </w:r>
-    </w:p>
-    <w:p>
-      <w:pPr>
-        <w:spacing w:line="360" w:lineRule="auto" w:before="0" w:after="0"/>
-        <w:ind w:firstLine="709"/>
-        <w:jc w:val="both"/>
-      </w:pPr>
-      <w:r>
-        <w:rPr>
-          <w:rFonts w:ascii="Times New Roman" w:hAnsi="Times New Roman"/>
-          <w:b w:val="0"/>
-          <w:i w:val="0"/>
-          <w:color w:val="000000"/>
-          <w:sz w:val="28"/>
-        </w:rPr>
-        <w:t>7 ДАЛЬНЕЙШЕЕ РАЗВИТИЕ</w:t>
-      </w:r>
-    </w:p>
-    <w:p>
-      <w:pPr>
-        <w:spacing w:line="360" w:lineRule="auto" w:before="0" w:after="0"/>
-        <w:ind w:firstLine="709"/>
-        <w:jc w:val="both"/>
-      </w:pPr>
-      <w:r>
-        <w:rPr>
-          <w:rFonts w:ascii="Times New Roman" w:hAnsi="Times New Roman"/>
-          <w:b w:val="0"/>
-          <w:i w:val="0"/>
-          <w:color w:val="000000"/>
-          <w:sz w:val="28"/>
-        </w:rPr>
-        <w:t>ЗАКЛЮЧЕНИЕ</w:t>
+        <w:t>6 ПРОВЕРКА РЕАЛИЗОВАННЫХ МОДУЛЕЙ</w:t>
+      </w:r>
+    </w:p>
+    <w:p>
+      <w:pPr>
+        <w:spacing w:line="360" w:lineRule="auto" w:before="0" w:after="0"/>
+        <w:ind w:firstLine="709"/>
+        <w:jc w:val="both"/>
+      </w:pPr>
+      <w:r>
+        <w:rPr>
+          <w:rFonts w:ascii="Times New Roman" w:hAnsi="Times New Roman"/>
+          <w:b w:val="0"/>
+          <w:i w:val="0"/>
+          <w:color w:val="000000"/>
+          <w:sz w:val="28"/>
+        </w:rPr>
+        <w:t>7 ПЛАН РАЗРАБОТКИ МОДУЛЕЙ 3–5</w:t>
       </w:r>
     </w:p>
     <w:p>
@@ -252,24 +235,24 @@
           <w:color w:val="000000"/>
           <w:sz w:val="28"/>
         </w:rPr>
-        <w:t>Для решения этой задачи разработано веб-приложение Encore. Гость открывает сайт по QR-коду, выбирает номер столика и отправляет заявку на композицию. Диджей видит заявки в своём пульте, одобряет их и управляет очередью. Посетители могут следить за статусом и голосовать за песни других столиков.</w:t>
-      </w:r>
-    </w:p>
-    <w:p>
-      <w:pPr>
-        <w:spacing w:line="360" w:lineRule="auto" w:before="0" w:after="0"/>
-        <w:ind w:firstLine="709"/>
-        <w:jc w:val="both"/>
-      </w:pPr>
-      <w:r>
-        <w:rPr>
-          <w:rFonts w:ascii="Times New Roman" w:hAnsi="Times New Roman"/>
-          <w:b w:val="0"/>
-          <w:i w:val="0"/>
-          <w:color w:val="000000"/>
-          <w:sz w:val="28"/>
-        </w:rPr>
-        <w:t>Серверная часть выполнена на C# с использованием ASP.NET Core. В проекте реализованы два функциональных модуля: гостевой и модуль диджея. Идентификация, каталог и голосование входят в гостевой модуль; настройки и отчёт относятся к пульту диджея. Такое разделение соответствует двум основным участникам работы системы.</w:t>
+        <w:t>Для решения этой задачи разрабатывается веб-приложение Encore. Гость открывает сайт по QR-коду, выбирает номер столика и отправляет заявку на композицию. Диджей видит заявки в своём пульте, одобряет их и управляет очередью. Посетители могут следить за статусом и голосовать за песни других столиков.</w:t>
+      </w:r>
+    </w:p>
+    <w:p>
+      <w:pPr>
+        <w:spacing w:line="360" w:lineRule="auto" w:before="0" w:after="0"/>
+        <w:ind w:firstLine="709"/>
+        <w:jc w:val="both"/>
+      </w:pPr>
+      <w:r>
+        <w:rPr>
+          <w:rFonts w:ascii="Times New Roman" w:hAnsi="Times New Roman"/>
+          <w:b w:val="0"/>
+          <w:i w:val="0"/>
+          <w:color w:val="000000"/>
+          <w:sz w:val="28"/>
+        </w:rPr>
+        <w:t>Серверная часть выполнена на C# с использованием ASP.NET Core. На текущем этапе реализованы модули 1 и 2: гостевой и модуль диджея. Проект не завершён: модули 3, 4 и 5 предстоит разработать. Идентификация, каталог и голосование входят в гостевой модуль; настройки и отчёт относятся к пульту диджея. Такое разделение соответствует двум основным участникам работы системы.</w:t>
       </w:r>
     </w:p>
     <w:p>
@@ -515,7 +498,7 @@
           <w:color w:val="000000"/>
           <w:sz w:val="28"/>
         </w:rPr>
-        <w:t>Приложение разделено на два модуля по действиям пользователей. Общие правила очереди, хранение данных и генерация QR-кодов используются обоими модулями и не выделяются в самостоятельные пользовательские разделы.</w:t>
+        <w:t>В этой части работы рассматриваются два уже реализованных модуля по действиям пользователей. Они составляют первый этап проекта, а не весь запланированный объём. Общие правила очереди, хранение данных и генерация QR-кодов используются обоими модулями и не выделяются в самостоятельные пользовательские разделы.</w:t>
       </w:r>
     </w:p>
     <w:p>
@@ -534,7 +517,7 @@
           <w:color w:val="000000"/>
           <w:sz w:val="28"/>
         </w:rPr>
-        <w:t>2.1 Гостевой модуль</w:t>
+        <w:t>2.1 Модуль 1 — Гостевой модуль</w:t>
       </w:r>
     </w:p>
     <w:p>
@@ -756,7 +739,7 @@
           <w:color w:val="000000"/>
           <w:sz w:val="28"/>
         </w:rPr>
-        <w:t>2.2 Модуль диджея</w:t>
+        <w:t>2.2 Модуль 2 — Пульт диджея</w:t>
       </w:r>
     </w:p>
     <w:p>
@@ -2157,7 +2140,94 @@
           <w:color w:val="000000"/>
           <w:sz w:val="28"/>
         </w:rPr>
-        <w:t>4.1 Порядок очереди и ожидание</w:t>
+        <w:t>4.1 Сохранение заявок и просмотр истории</w:t>
+      </w:r>
+    </w:p>
+    <w:p>
+      <w:pPr>
+        <w:spacing w:line="360" w:lineRule="auto" w:before="0" w:after="0"/>
+        <w:ind w:firstLine="709"/>
+        <w:jc w:val="both"/>
+      </w:pPr>
+      <w:r>
+        <w:rPr>
+          <w:rFonts w:ascii="Times New Roman" w:hAnsi="Times New Roman"/>
+          <w:b w:val="0"/>
+          <w:i w:val="0"/>
+          <w:color w:val="000000"/>
+          <w:sz w:val="28"/>
+        </w:rPr>
+        <w:t>В этой версии сохраняются музыкальные заявки, а не аудиофайлы песен. При заказе создаётся запись с идентификатором композиции TrackId, номером столика Table, статусом Status и временем Created. При запуске выступления записывается Started, а при голосовании — номера поддержавших столиков Votes. Изменения сохраняются автоматически.</w:t>
+      </w:r>
+    </w:p>
+    <w:p>
+      <w:pPr>
+        <w:spacing w:line="360" w:lineRule="auto" w:before="0" w:after="0"/>
+        <w:ind w:firstLine="709"/>
+        <w:jc w:val="both"/>
+      </w:pPr>
+      <w:r>
+        <w:rPr>
+          <w:rFonts w:ascii="Times New Roman" w:hAnsi="Times New Roman"/>
+          <w:b w:val="0"/>
+          <w:i w:val="0"/>
+          <w:color w:val="000000"/>
+          <w:sz w:val="28"/>
+        </w:rPr>
+        <w:t>Отдельной базы SQLite, PostgreSQL или SQL Server пока нет. Роль временного хранилища выполняет App_Data/state.json. При запуске исходного проекта этот файл находится в папке проекта, а в версии для флешки — в App_Data рядом с Encore.exe. Папка появляется после первого запуска. Если задана переменная ENCORE_DATA_DIR, данные находятся по указанному в ней пути. В Docker используется каталог /data в отдельном volume.</w:t>
+      </w:r>
+    </w:p>
+    <w:p>
+      <w:pPr>
+        <w:spacing w:line="360" w:lineRule="auto" w:before="0" w:after="0"/>
+        <w:ind w:firstLine="709"/>
+        <w:jc w:val="both"/>
+      </w:pPr>
+      <w:r>
+        <w:rPr>
+          <w:rFonts w:ascii="Times New Roman" w:hAnsi="Times New Roman"/>
+          <w:b w:val="0"/>
+          <w:i w:val="0"/>
+          <w:color w:val="000000"/>
+          <w:sz w:val="28"/>
+        </w:rPr>
+        <w:t>Гость открывает блок «Мои заявки» под очередью и видит до 20 завершённых, отклонённых или пропущенных заявок своего столика. Диджей открывает «История вечера» в пульте и видит до 20 таких заявок по всем столикам. Активные заявки остаются в очереди. Для просмотра всех сохранённых записей можно скачать CSV из пульта.</w:t>
+      </w:r>
+    </w:p>
+    <w:p>
+      <w:pPr>
+        <w:spacing w:line="360" w:lineRule="auto" w:before="0" w:after="0"/>
+        <w:ind w:firstLine="709"/>
+        <w:jc w:val="both"/>
+      </w:pPr>
+      <w:r>
+        <w:rPr>
+          <w:rFonts w:ascii="Times New Roman" w:hAnsi="Times New Roman"/>
+          <w:b w:val="0"/>
+          <w:i w:val="0"/>
+          <w:color w:val="000000"/>
+          <w:sz w:val="28"/>
+        </w:rPr>
+        <w:t>Файл state.json также можно открыть в Блокноте: список Orders содержит все сохранённые заявки. Названия песен определяются по TrackId из каталога Core/TrackCatalog.cs. Файл нельзя редактировать при работающем приложении: очередное сохранение может перезаписать изменения. Перед ручными действиями следует остановить сервер и сделать копию файла.</w:t>
+      </w:r>
+    </w:p>
+    <w:p>
+      <w:pPr>
+        <w:pStyle w:val="2"/>
+        <w:keepNext/>
+        <w:spacing w:line="360" w:lineRule="auto" w:before="0" w:after="0"/>
+        <w:ind w:firstLine="709"/>
+        <w:jc w:val="both"/>
+      </w:pPr>
+      <w:r>
+        <w:rPr>
+          <w:rFonts w:ascii="Times New Roman" w:hAnsi="Times New Roman"/>
+          <w:b w:val="0"/>
+          <w:i w:val="0"/>
+          <w:color w:val="000000"/>
+          <w:sz w:val="28"/>
+        </w:rPr>
+        <w:t>4.2 Порядок очереди и ожидание</w:t>
       </w:r>
     </w:p>
     <w:p>
@@ -2924,24 +2994,24 @@
           <w:color w:val="000000"/>
           <w:sz w:val="28"/>
         </w:rPr>
-        <w:t>6 ПРОВЕРКА РАБОТОСПОСОБНОСТИ</w:t>
-      </w:r>
-    </w:p>
-    <w:p>
-      <w:pPr>
-        <w:spacing w:line="360" w:lineRule="auto" w:before="0" w:after="0"/>
-        <w:ind w:firstLine="709"/>
-        <w:jc w:val="both"/>
-      </w:pPr>
-      <w:r>
-        <w:rPr>
-          <w:rFonts w:ascii="Times New Roman" w:hAnsi="Times New Roman"/>
-          <w:b w:val="0"/>
-          <w:i w:val="0"/>
-          <w:color w:val="000000"/>
-          <w:sz w:val="28"/>
-        </w:rPr>
-        <w:t>Сборка приложения завершилась без ошибок и предупреждений. Сценарий scripts/smoke.py выполнил 69 HTTP-проверок на отдельном сервере с временным хранилищем. Это позволяет проверить правила работы без изменения пользовательских данных.</w:t>
+        <w:t>6 ПРОВЕРКА РЕАЛИЗОВАННЫХ МОДУЛЕЙ</w:t>
+      </w:r>
+    </w:p>
+    <w:p>
+      <w:pPr>
+        <w:spacing w:line="360" w:lineRule="auto" w:before="0" w:after="0"/>
+        <w:ind w:firstLine="709"/>
+        <w:jc w:val="both"/>
+      </w:pPr>
+      <w:r>
+        <w:rPr>
+          <w:rFonts w:ascii="Times New Roman" w:hAnsi="Times New Roman"/>
+          <w:b w:val="0"/>
+          <w:i w:val="0"/>
+          <w:color w:val="000000"/>
+          <w:sz w:val="28"/>
+        </w:rPr>
+        <w:t>Проверки относятся к текущему этапу — модулям 1 и 2. Они не подтверждают готовность ещё не разработанных модулей 3–5. Сборка приложения завершилась без ошибок и предупреждений. Сценарий scripts/smoke.py выполнил 69 HTTP-проверок на отдельном сервере с временным хранилищем. Это позволяет проверить правила работы без изменения пользовательских данных.</w:t>
       </w:r>
     </w:p>
     <w:p>
@@ -3578,24 +3648,24 @@
           <w:color w:val="000000"/>
           <w:sz w:val="28"/>
         </w:rPr>
-        <w:t>7 ДАЛЬНЕЙШЕЕ РАЗВИТИЕ</w:t>
-      </w:r>
-    </w:p>
-    <w:p>
-      <w:pPr>
-        <w:spacing w:line="360" w:lineRule="auto" w:before="0" w:after="0"/>
-        <w:ind w:firstLine="709"/>
-        <w:jc w:val="both"/>
-      </w:pPr>
-      <w:r>
-        <w:rPr>
-          <w:rFonts w:ascii="Times New Roman" w:hAnsi="Times New Roman"/>
-          <w:b w:val="0"/>
-          <w:i w:val="0"/>
-          <w:color w:val="000000"/>
-          <w:sz w:val="28"/>
-        </w:rPr>
-        <w:t>Следующий этап можно начать с переноса данных в СУБД и добавления администрирования. Это позволит изменять каталог без редактирования кода и создавать отдельные учётные записи сотрудников. Остальные модули следует вводить по мере необходимости заведения.</w:t>
+        <w:t>7 ПЛАН РАЗРАБОТКИ МОДУЛЕЙ 3–5</w:t>
+      </w:r>
+    </w:p>
+    <w:p>
+      <w:pPr>
+        <w:spacing w:line="360" w:lineRule="auto" w:before="0" w:after="0"/>
+        <w:ind w:firstLine="709"/>
+        <w:jc w:val="both"/>
+      </w:pPr>
+      <w:r>
+        <w:rPr>
+          <w:rFonts w:ascii="Times New Roman" w:hAnsi="Times New Roman"/>
+          <w:b w:val="0"/>
+          <w:i w:val="0"/>
+          <w:color w:val="000000"/>
+          <w:sz w:val="28"/>
+        </w:rPr>
+        <w:t>Разработка проекта продолжается. Модули 1 и 2 позволяют проверить работу заявок и очереди, но не закрывают весь план. Ниже приведён предварительный состав следующих трёх модулей. Его можно уточнить перед началом реализации.</w:t>
       </w:r>
     </w:p>
     <w:p>
@@ -3613,7 +3683,7 @@
           <w:color w:val="000000"/>
           <w:sz w:val="28"/>
         </w:rPr>
-        <w:t>Таблица 6 — Возможные дополнительные модули</w:t>
+        <w:t>Таблица 6 — Предварительный план следующих модулей</w:t>
       </w:r>
     </w:p>
     <w:tbl>
@@ -3674,7 +3744,7 @@
                 <w:color w:val="000000"/>
                 <w:sz w:val="28"/>
               </w:rPr>
-              <w:t>Возможности</w:t>
+              <w:t>Запланированная работа</w:t>
             </w:r>
           </w:p>
         </w:tc>
@@ -3699,27 +3769,27 @@
                 <w:color w:val="000000"/>
                 <w:sz w:val="28"/>
               </w:rPr>
-              <w:t>Администрирование</w:t>
-            </w:r>
-          </w:p>
-        </w:tc>
-        <w:tc>
-          <w:tcPr>
-            <w:tcW w:type="dxa" w:w="4677"/>
-          </w:tcPr>
-          <w:p>
-            <w:pPr>
-              <w:spacing w:line="240" w:lineRule="auto" w:after="0"/>
-              <w:ind w:firstLine="0"/>
-            </w:pPr>
-            <w:r>
-              <w:rPr>
-                <w:rFonts w:ascii="Times New Roman" w:hAnsi="Times New Roman"/>
-                <w:b w:val="0"/>
-                <w:color w:val="000000"/>
-                <w:sz w:val="28"/>
-              </w:rPr>
-              <w:t>Редактирование каталога, столиков и прав сотрудников.</w:t>
+              <w:t>Модуль 3 — Администрирование</w:t>
+            </w:r>
+          </w:p>
+        </w:tc>
+        <w:tc>
+          <w:tcPr>
+            <w:tcW w:type="dxa" w:w="4677"/>
+          </w:tcPr>
+          <w:p>
+            <w:pPr>
+              <w:spacing w:line="240" w:lineRule="auto" w:after="0"/>
+              <w:ind w:firstLine="0"/>
+            </w:pPr>
+            <w:r>
+              <w:rPr>
+                <w:rFonts w:ascii="Times New Roman" w:hAnsi="Times New Roman"/>
+                <w:b w:val="0"/>
+                <w:color w:val="000000"/>
+                <w:sz w:val="28"/>
+              </w:rPr>
+              <w:t>Редактирование каталога и столиков, отдельные учётные записи сотрудников. Перенос данных в СУБД.</w:t>
             </w:r>
           </w:p>
         </w:tc>
@@ -3744,27 +3814,27 @@
                 <w:color w:val="000000"/>
                 <w:sz w:val="28"/>
               </w:rPr>
-              <w:t>Проигрыватель</w:t>
-            </w:r>
-          </w:p>
-        </w:tc>
-        <w:tc>
-          <w:tcPr>
-            <w:tcW w:type="dxa" w:w="4677"/>
-          </w:tcPr>
-          <w:p>
-            <w:pPr>
-              <w:spacing w:line="240" w:lineRule="auto" w:after="0"/>
-              <w:ind w:firstLine="0"/>
-            </w:pPr>
-            <w:r>
-              <w:rPr>
-                <w:rFonts w:ascii="Times New Roman" w:hAnsi="Times New Roman"/>
-                <w:b w:val="0"/>
-                <w:color w:val="000000"/>
-                <w:sz w:val="28"/>
-              </w:rPr>
-              <w:t>Лицензированные фонограммы, текст караоке и управление звуком.</w:t>
+              <w:t>Модуль 4 — Проигрыватель</w:t>
+            </w:r>
+          </w:p>
+        </w:tc>
+        <w:tc>
+          <w:tcPr>
+            <w:tcW w:type="dxa" w:w="4677"/>
+          </w:tcPr>
+          <w:p>
+            <w:pPr>
+              <w:spacing w:line="240" w:lineRule="auto" w:after="0"/>
+              <w:ind w:firstLine="0"/>
+            </w:pPr>
+            <w:r>
+              <w:rPr>
+                <w:rFonts w:ascii="Times New Roman" w:hAnsi="Times New Roman"/>
+                <w:b w:val="0"/>
+                <w:color w:val="000000"/>
+                <w:sz w:val="28"/>
+              </w:rPr>
+              <w:t>Подключение лицензированных фонограмм, текста караоке, паузы и громкости.</w:t>
             </w:r>
           </w:p>
         </w:tc>
@@ -3789,207 +3859,27 @@
                 <w:color w:val="000000"/>
                 <w:sz w:val="28"/>
               </w:rPr>
-              <w:t>Аналитика</w:t>
-            </w:r>
-          </w:p>
-        </w:tc>
-        <w:tc>
-          <w:tcPr>
-            <w:tcW w:type="dxa" w:w="4677"/>
-          </w:tcPr>
-          <w:p>
-            <w:pPr>
-              <w:spacing w:line="240" w:lineRule="auto" w:after="0"/>
-              <w:ind w:firstLine="0"/>
-            </w:pPr>
-            <w:r>
-              <w:rPr>
-                <w:rFonts w:ascii="Times New Roman" w:hAnsi="Times New Roman"/>
-                <w:b w:val="0"/>
-                <w:color w:val="000000"/>
-                <w:sz w:val="28"/>
-              </w:rPr>
-              <w:t>Популярные песни, активность столиков, графики.</w:t>
-            </w:r>
-          </w:p>
-        </w:tc>
-      </w:tr>
-      <w:tr>
-        <w:trPr>
-          <w:cantSplit/>
-        </w:trPr>
-        <w:tc>
-          <w:tcPr>
-            <w:tcW w:type="dxa" w:w="4677"/>
-          </w:tcPr>
-          <w:p>
-            <w:pPr>
-              <w:spacing w:line="240" w:lineRule="auto" w:after="0"/>
-              <w:ind w:firstLine="0"/>
-            </w:pPr>
-            <w:r>
-              <w:rPr>
-                <w:rFonts w:ascii="Times New Roman" w:hAnsi="Times New Roman"/>
-                <w:b w:val="0"/>
-                <w:color w:val="000000"/>
-                <w:sz w:val="28"/>
-              </w:rPr>
-              <w:t>Бронирование</w:t>
-            </w:r>
-          </w:p>
-        </w:tc>
-        <w:tc>
-          <w:tcPr>
-            <w:tcW w:type="dxa" w:w="4677"/>
-          </w:tcPr>
-          <w:p>
-            <w:pPr>
-              <w:spacing w:line="240" w:lineRule="auto" w:after="0"/>
-              <w:ind w:firstLine="0"/>
-            </w:pPr>
-            <w:r>
-              <w:rPr>
-                <w:rFonts w:ascii="Times New Roman" w:hAnsi="Times New Roman"/>
-                <w:b w:val="0"/>
-                <w:color w:val="000000"/>
-                <w:sz w:val="28"/>
-              </w:rPr>
-              <w:t>Запись на столики и караоке-комнаты.</w:t>
-            </w:r>
-          </w:p>
-        </w:tc>
-      </w:tr>
-      <w:tr>
-        <w:trPr>
-          <w:cantSplit/>
-        </w:trPr>
-        <w:tc>
-          <w:tcPr>
-            <w:tcW w:type="dxa" w:w="4677"/>
-          </w:tcPr>
-          <w:p>
-            <w:pPr>
-              <w:spacing w:line="240" w:lineRule="auto" w:after="0"/>
-              <w:ind w:firstLine="0"/>
-            </w:pPr>
-            <w:r>
-              <w:rPr>
-                <w:rFonts w:ascii="Times New Roman" w:hAnsi="Times New Roman"/>
-                <w:b w:val="0"/>
-                <w:color w:val="000000"/>
-                <w:sz w:val="28"/>
-              </w:rPr>
-              <w:t>Лояльность</w:t>
-            </w:r>
-          </w:p>
-        </w:tc>
-        <w:tc>
-          <w:tcPr>
-            <w:tcW w:type="dxa" w:w="4677"/>
-          </w:tcPr>
-          <w:p>
-            <w:pPr>
-              <w:spacing w:line="240" w:lineRule="auto" w:after="0"/>
-              <w:ind w:firstLine="0"/>
-            </w:pPr>
-            <w:r>
-              <w:rPr>
-                <w:rFonts w:ascii="Times New Roman" w:hAnsi="Times New Roman"/>
-                <w:b w:val="0"/>
-                <w:color w:val="000000"/>
-                <w:sz w:val="28"/>
-              </w:rPr>
-              <w:t>Баллы, награды и любимые песни.</w:t>
-            </w:r>
-          </w:p>
-        </w:tc>
-      </w:tr>
-      <w:tr>
-        <w:trPr>
-          <w:cantSplit/>
-        </w:trPr>
-        <w:tc>
-          <w:tcPr>
-            <w:tcW w:type="dxa" w:w="4677"/>
-          </w:tcPr>
-          <w:p>
-            <w:pPr>
-              <w:spacing w:line="240" w:lineRule="auto" w:after="0"/>
-              <w:ind w:firstLine="0"/>
-            </w:pPr>
-            <w:r>
-              <w:rPr>
-                <w:rFonts w:ascii="Times New Roman" w:hAnsi="Times New Roman"/>
-                <w:b w:val="0"/>
-                <w:color w:val="000000"/>
-                <w:sz w:val="28"/>
-              </w:rPr>
-              <w:t>Оплата</w:t>
-            </w:r>
-          </w:p>
-        </w:tc>
-        <w:tc>
-          <w:tcPr>
-            <w:tcW w:type="dxa" w:w="4677"/>
-          </w:tcPr>
-          <w:p>
-            <w:pPr>
-              <w:spacing w:line="240" w:lineRule="auto" w:after="0"/>
-              <w:ind w:firstLine="0"/>
-            </w:pPr>
-            <w:r>
-              <w:rPr>
-                <w:rFonts w:ascii="Times New Roman" w:hAnsi="Times New Roman"/>
-                <w:b w:val="0"/>
-                <w:color w:val="000000"/>
-                <w:sz w:val="28"/>
-              </w:rPr>
-              <w:t>Оплата музыкального слота, чеки и возвраты.</w:t>
-            </w:r>
-          </w:p>
-        </w:tc>
-      </w:tr>
-      <w:tr>
-        <w:trPr>
-          <w:cantSplit/>
-        </w:trPr>
-        <w:tc>
-          <w:tcPr>
-            <w:tcW w:type="dxa" w:w="4677"/>
-          </w:tcPr>
-          <w:p>
-            <w:pPr>
-              <w:spacing w:line="240" w:lineRule="auto" w:after="0"/>
-              <w:ind w:firstLine="0"/>
-            </w:pPr>
-            <w:r>
-              <w:rPr>
-                <w:rFonts w:ascii="Times New Roman" w:hAnsi="Times New Roman"/>
-                <w:b w:val="0"/>
-                <w:color w:val="000000"/>
-                <w:sz w:val="28"/>
-              </w:rPr>
-              <w:t>Экран зала</w:t>
-            </w:r>
-          </w:p>
-        </w:tc>
-        <w:tc>
-          <w:tcPr>
-            <w:tcW w:type="dxa" w:w="4677"/>
-          </w:tcPr>
-          <w:p>
-            <w:pPr>
-              <w:spacing w:line="240" w:lineRule="auto" w:after="0"/>
-              <w:ind w:firstLine="0"/>
-            </w:pPr>
-            <w:r>
-              <w:rPr>
-                <w:rFonts w:ascii="Times New Roman" w:hAnsi="Times New Roman"/>
-                <w:b w:val="0"/>
-                <w:color w:val="000000"/>
-                <w:sz w:val="28"/>
-              </w:rPr>
-              <w:t>Очередь и QR на телевизоре.</w:t>
+              <w:t>Модуль 5 — Аналитика</w:t>
+            </w:r>
+          </w:p>
+        </w:tc>
+        <w:tc>
+          <w:tcPr>
+            <w:tcW w:type="dxa" w:w="4677"/>
+          </w:tcPr>
+          <w:p>
+            <w:pPr>
+              <w:spacing w:line="240" w:lineRule="auto" w:after="0"/>
+              <w:ind w:firstLine="0"/>
+            </w:pPr>
+            <w:r>
+              <w:rPr>
+                <w:rFonts w:ascii="Times New Roman" w:hAnsi="Times New Roman"/>
+                <w:b w:val="0"/>
+                <w:color w:val="000000"/>
+                <w:sz w:val="28"/>
+              </w:rPr>
+              <w:t>Полная история заявок, популярные песни, активность столиков, графики и отчёты.</w:t>
             </w:r>
           </w:p>
         </w:tc>
@@ -4016,60 +3906,7 @@
           <w:color w:val="000000"/>
           <w:sz w:val="28"/>
         </w:rPr>
-        <w:t>Перечисленные модули не входят в текущую реализацию. Для проигрывателя потребуются аудиоматериалы с разрешением на использование; для платежей — отдельный платёжный провайдер и обработка подтверждений оплаты.</w:t>
-      </w:r>
-    </w:p>
-    <w:p>
-      <w:pPr>
-        <w:pStyle w:val="1"/>
-        <w:keepNext/>
-        <w:spacing w:line="360" w:lineRule="auto" w:before="0" w:after="0"/>
-        <w:ind w:firstLine="709"/>
-        <w:jc w:val="both"/>
-      </w:pPr>
-      <w:r>
-        <w:rPr>
-          <w:rFonts w:ascii="Times New Roman" w:hAnsi="Times New Roman"/>
-          <w:b w:val="0"/>
-          <w:i w:val="0"/>
-          <w:color w:val="000000"/>
-          <w:sz w:val="28"/>
-        </w:rPr>
-        <w:t>ЗАКЛЮЧЕНИЕ</w:t>
-      </w:r>
-    </w:p>
-    <w:p>
-      <w:pPr>
-        <w:spacing w:line="360" w:lineRule="auto" w:before="0" w:after="0"/>
-        <w:ind w:firstLine="709"/>
-        <w:jc w:val="both"/>
-      </w:pPr>
-      <w:r>
-        <w:rPr>
-          <w:rFonts w:ascii="Times New Roman" w:hAnsi="Times New Roman"/>
-          <w:b w:val="0"/>
-          <w:i w:val="0"/>
-          <w:color w:val="000000"/>
-          <w:sz w:val="28"/>
-        </w:rPr>
-        <w:t>В ходе работы создана информационная система Encore на C# с двумя модулями. Гость выбирает столик и композицию, отправляет заявку и следит за очередью. Диджей подтверждает заявки, управляет выступлениями и меняет ограничения. Данные сохраняются после перезапуска, а интерфейс работает на компьютере и мобильном экране.</w:t>
-      </w:r>
-    </w:p>
-    <w:p>
-      <w:pPr>
-        <w:spacing w:line="360" w:lineRule="auto" w:before="0" w:after="0"/>
-        <w:ind w:firstLine="709"/>
-        <w:jc w:val="both"/>
-      </w:pPr>
-      <w:r>
-        <w:rPr>
-          <w:rFonts w:ascii="Times New Roman" w:hAnsi="Times New Roman"/>
-          <w:b w:val="0"/>
-          <w:i w:val="0"/>
-          <w:color w:val="000000"/>
-          <w:sz w:val="28"/>
-        </w:rPr>
-        <w:t>Основные сценарии проверены через API и в браузере. Подготовлены исходный проект, пакет для показа на Windows и файлы размещения на VPS. Для использования в реальном заведении необходимы дальнейшая проверка сервера, защищённый доступ и подключение законных фонограмм.</w:t>
+        <w:t>Эти модули пока не реализованы. Сначала потребуется выбрать СУБД и подготовить перенос существующих заявок без потери истории. Для проигрывателя необходимо отдельно определить источник аудио и права на его использование. После выполнения новых этапов документ будет дополнен описанием их работы и результатами проверок.</w:t>
       </w:r>
     </w:p>
     <w:p>

</xml_diff>